<commit_message>
07.05.26 list changes: 1. практика числовые типы (✍️ 2 - budget_calculation)
</commit_message>
<xml_diff>
--- a/AQA/Теория/📝 aqa подготовка.docx
+++ b/AQA/Теория/📝 aqa подготовка.docx
@@ -30067,6 +30067,7 @@
           <w:color w:val="0070C0"/>
           <w:sz w:val="20"/>
           <w:szCs w:val="20"/>
+          <w:lang w:val="en-US"/>
         </w:rPr>
       </w:pPr>
       <w:bookmarkStart w:id="12" w:name="_1_-_Числовые"/>
@@ -30153,10 +30154,10 @@
           <w:noProof/>
         </w:rPr>
         <w:drawing>
-          <wp:inline distT="0" distB="0" distL="0" distR="0" wp14:anchorId="0BFB6EBC" wp14:editId="782B9B9E">
-            <wp:extent cx="5888736" cy="2112551"/>
-            <wp:effectExtent l="95250" t="114300" r="93345" b="116840"/>
-            <wp:docPr id="728496662" name="Рисунок 1"/>
+          <wp:inline distT="0" distB="0" distL="0" distR="0" wp14:anchorId="50CA588A" wp14:editId="0E785A48">
+            <wp:extent cx="5947410" cy="3266266"/>
+            <wp:effectExtent l="95250" t="114300" r="91440" b="106045"/>
+            <wp:docPr id="1813332249" name="Рисунок 1"/>
             <wp:cNvGraphicFramePr>
               <a:graphicFrameLocks xmlns:a="http://schemas.openxmlformats.org/drawingml/2006/main" noChangeAspect="1"/>
             </wp:cNvGraphicFramePr>
@@ -30164,7 +30165,7 @@
               <a:graphicData uri="http://schemas.openxmlformats.org/drawingml/2006/picture">
                 <pic:pic xmlns:pic="http://schemas.openxmlformats.org/drawingml/2006/picture">
                   <pic:nvPicPr>
-                    <pic:cNvPr id="728496662" name=""/>
+                    <pic:cNvPr id="1813332249" name=""/>
                     <pic:cNvPicPr/>
                   </pic:nvPicPr>
                   <pic:blipFill>
@@ -30176,7 +30177,7 @@
                   <pic:spPr>
                     <a:xfrm>
                       <a:off x="0" y="0"/>
-                      <a:ext cx="5932263" cy="2128166"/>
+                      <a:ext cx="5963272" cy="3274977"/>
                     </a:xfrm>
                     <a:prstGeom prst="rect">
                       <a:avLst/>
@@ -30836,6 +30837,7 @@
           <w:sz w:val="18"/>
           <w:szCs w:val="18"/>
         </w:rPr>
+        <w:lastRenderedPageBreak/>
         <w:t>Телефонная книга:</w:t>
       </w:r>
       <w:r>
@@ -30975,7 +30977,6 @@
           <w:sz w:val="18"/>
           <w:szCs w:val="18"/>
         </w:rPr>
-        <w:lastRenderedPageBreak/>
         <w:t>Кортежи</w:t>
       </w:r>
       <w:r>

</xml_diff>

<commit_message>
01.06.26 list changes: phone_book
</commit_message>
<xml_diff>
--- a/AQA/Теория/📝 aqa подготовка.docx
+++ b/AQA/Теория/📝 aqa подготовка.docx
@@ -21988,6 +21988,7 @@
           <w:spacing w:val="-1"/>
           <w:sz w:val="18"/>
           <w:szCs w:val="18"/>
+          <w:lang w:val="en-US"/>
         </w:rPr>
       </w:pPr>
       <w:r>
@@ -22043,6 +22044,106 @@
           <w:szCs w:val="18"/>
         </w:rPr>
         <w:t> типах данных.</w:t>
+      </w:r>
+    </w:p>
+    <w:p>
+      <w:pPr>
+        <w:spacing w:after="0"/>
+        <w:rPr>
+          <w:rFonts w:ascii="Times New Roman" w:hAnsi="Times New Roman" w:cs="Times New Roman"/>
+          <w:color w:val="000000" w:themeColor="text1"/>
+          <w:spacing w:val="-1"/>
+          <w:sz w:val="18"/>
+          <w:szCs w:val="18"/>
+          <w:lang w:val="en-US"/>
+        </w:rPr>
+      </w:pPr>
+    </w:p>
+    <w:p>
+      <w:pPr>
+        <w:spacing w:after="0"/>
+        <w:rPr>
+          <w:rFonts w:ascii="Times New Roman" w:hAnsi="Times New Roman" w:cs="Times New Roman"/>
+          <w:color w:val="000000" w:themeColor="text1"/>
+          <w:spacing w:val="-1"/>
+          <w:sz w:val="18"/>
+          <w:szCs w:val="18"/>
+          <w:lang w:val="en-US"/>
+        </w:rPr>
+      </w:pPr>
+      <w:r>
+        <w:rPr>
+          <w:rFonts w:ascii="Times New Roman" w:hAnsi="Times New Roman" w:cs="Times New Roman"/>
+          <w:color w:val="000000" w:themeColor="text1"/>
+          <w:spacing w:val="-1"/>
+          <w:sz w:val="18"/>
+          <w:szCs w:val="18"/>
+        </w:rPr>
+        <w:t>Последовательность </w:t>
+      </w:r>
+      <w:r>
+        <w:rPr>
+          <w:rFonts w:ascii="Times New Roman" w:hAnsi="Times New Roman" w:cs="Times New Roman"/>
+          <w:b/>
+          <w:bCs/>
+          <w:color w:val="000000" w:themeColor="text1"/>
+          <w:spacing w:val="-1"/>
+          <w:sz w:val="18"/>
+          <w:szCs w:val="18"/>
+        </w:rPr>
+        <w:t>— это тип данных в Python, который может хранить более одного значения (или менее одного, поскольку последовательность может быть пустой), и эти значения можно просматривать последовательно (отсюда и название)</w:t>
+      </w:r>
+      <w:r>
+        <w:rPr>
+          <w:rFonts w:ascii="Times New Roman" w:hAnsi="Times New Roman" w:cs="Times New Roman"/>
+          <w:color w:val="000000" w:themeColor="text1"/>
+          <w:spacing w:val="-1"/>
+          <w:sz w:val="18"/>
+          <w:szCs w:val="18"/>
+        </w:rPr>
+        <w:t> , элемент за элементом.</w:t>
+      </w:r>
+      <w:r>
+        <w:rPr>
+          <w:rFonts w:ascii="Times New Roman" w:hAnsi="Times New Roman" w:cs="Times New Roman"/>
+          <w:color w:val="000000" w:themeColor="text1"/>
+          <w:spacing w:val="-1"/>
+          <w:sz w:val="18"/>
+          <w:szCs w:val="18"/>
+        </w:rPr>
+        <w:t xml:space="preserve"> </w:t>
+      </w:r>
+      <w:r>
+        <w:rPr>
+          <w:rFonts w:ascii="Times New Roman" w:hAnsi="Times New Roman" w:cs="Times New Roman"/>
+          <w:b/>
+          <w:bCs/>
+          <w:color w:val="000000" w:themeColor="text1"/>
+          <w:spacing w:val="-1"/>
+          <w:sz w:val="18"/>
+          <w:szCs w:val="18"/>
+        </w:rPr>
+        <w:t>Список</w:t>
+      </w:r>
+      <w:r>
+        <w:rPr>
+          <w:rFonts w:ascii="Times New Roman" w:hAnsi="Times New Roman" w:cs="Times New Roman"/>
+          <w:color w:val="000000" w:themeColor="text1"/>
+          <w:spacing w:val="-1"/>
+          <w:sz w:val="18"/>
+          <w:szCs w:val="18"/>
+        </w:rPr>
+        <w:t xml:space="preserve"> — это классический пример последовательности</w:t>
+      </w:r>
+      <w:r>
+        <w:rPr>
+          <w:rFonts w:ascii="Times New Roman" w:hAnsi="Times New Roman" w:cs="Times New Roman"/>
+          <w:color w:val="000000" w:themeColor="text1"/>
+          <w:spacing w:val="-1"/>
+          <w:sz w:val="18"/>
+          <w:szCs w:val="18"/>
+        </w:rPr>
+        <w:t>.</w:t>
       </w:r>
     </w:p>
     <w:p>

</xml_diff>

<commit_message>
03.06.26 list changes: all_dictionaries
</commit_message>
<xml_diff>
--- a/AQA/Теория/📝 aqa подготовка.docx
+++ b/AQA/Теория/📝 aqa подготовка.docx
@@ -3362,7 +3362,25 @@
           <w:sz w:val="18"/>
           <w:szCs w:val="18"/>
         </w:rPr>
-        <w:t>. Продолжая тему примера с телефоном: проверил уведомления (пока смотрел</w:t>
+        <w:t>. Продолжая тему примера с телефоном</w:t>
+      </w:r>
+      <w:proofErr w:type="gramStart"/>
+      <w:r>
+        <w:rPr>
+          <w:rFonts w:ascii="Times New Roman" w:hAnsi="Times New Roman" w:cs="Times New Roman"/>
+          <w:sz w:val="18"/>
+          <w:szCs w:val="18"/>
+        </w:rPr>
+        <w:t>:</w:t>
+      </w:r>
+      <w:proofErr w:type="gramEnd"/>
+      <w:r>
+        <w:rPr>
+          <w:rFonts w:ascii="Times New Roman" w:hAnsi="Times New Roman" w:cs="Times New Roman"/>
+          <w:sz w:val="18"/>
+          <w:szCs w:val="18"/>
+        </w:rPr>
+        <w:t xml:space="preserve"> проверил уведомления (пока смотрел</w:t>
       </w:r>
       <w:r>
         <w:rPr>
@@ -8667,7 +8685,18 @@
           <w:sz w:val="18"/>
           <w:szCs w:val="18"/>
         </w:rPr>
-        <w:t>Обратный путь:</w:t>
+        <w:t>Обратный путь</w:t>
+      </w:r>
+      <w:proofErr w:type="gramStart"/>
+      <w:r>
+        <w:rPr>
+          <w:rFonts w:ascii="Times New Roman" w:hAnsi="Times New Roman" w:cs="Times New Roman"/>
+          <w:b/>
+          <w:bCs/>
+          <w:sz w:val="18"/>
+          <w:szCs w:val="18"/>
+        </w:rPr>
+        <w:t>:</w:t>
       </w:r>
       <w:r>
         <w:rPr>
@@ -8683,7 +8712,16 @@
           <w:sz w:val="18"/>
           <w:szCs w:val="18"/>
         </w:rPr>
-        <w:t>При промахе по кэшу данные подгружаются из более медленного уровня памяти и размещаются в кэшах согласно политике конкретной архитектуры; в упрощении можно считать, что они подтягиваются ближе к ядру — в сторону L1.</w:t>
+        <w:t>При</w:t>
+      </w:r>
+      <w:proofErr w:type="gramEnd"/>
+      <w:r>
+        <w:rPr>
+          <w:rFonts w:ascii="Times New Roman" w:hAnsi="Times New Roman" w:cs="Times New Roman"/>
+          <w:sz w:val="18"/>
+          <w:szCs w:val="18"/>
+        </w:rPr>
+        <w:t xml:space="preserve"> промахе по кэшу данные подгружаются из более медленного уровня памяти и размещаются в кэшах согласно политике конкретной архитектуры; в упрощении можно считать, что они подтягиваются ближе к ядру — в сторону L1.</w:t>
       </w:r>
     </w:p>
     <w:p>
@@ -21988,7 +22026,6 @@
           <w:spacing w:val="-1"/>
           <w:sz w:val="18"/>
           <w:szCs w:val="18"/>
-          <w:lang w:val="en-US"/>
         </w:rPr>
       </w:pPr>
       <w:r>
@@ -22055,7 +22092,6 @@
           <w:spacing w:val="-1"/>
           <w:sz w:val="18"/>
           <w:szCs w:val="18"/>
-          <w:lang w:val="en-US"/>
         </w:rPr>
       </w:pPr>
     </w:p>
@@ -22068,7 +22104,6 @@
           <w:spacing w:val="-1"/>
           <w:sz w:val="18"/>
           <w:szCs w:val="18"/>
-          <w:lang w:val="en-US"/>
         </w:rPr>
       </w:pPr>
       <w:r>
@@ -22101,49 +22136,29 @@
           <w:sz w:val="18"/>
           <w:szCs w:val="18"/>
         </w:rPr>
-        <w:t> , элемент за элементом.</w:t>
-      </w:r>
-      <w:r>
-        <w:rPr>
-          <w:rFonts w:ascii="Times New Roman" w:hAnsi="Times New Roman" w:cs="Times New Roman"/>
+        <w:t xml:space="preserve"> , элемент за элементом. </w:t>
+      </w:r>
+      <w:r>
+        <w:rPr>
+          <w:rFonts w:ascii="Times New Roman" w:hAnsi="Times New Roman" w:cs="Times New Roman"/>
+          <w:b/>
+          <w:bCs/>
           <w:color w:val="000000" w:themeColor="text1"/>
           <w:spacing w:val="-1"/>
           <w:sz w:val="18"/>
           <w:szCs w:val="18"/>
         </w:rPr>
-        <w:t xml:space="preserve"> </w:t>
-      </w:r>
-      <w:r>
-        <w:rPr>
-          <w:rFonts w:ascii="Times New Roman" w:hAnsi="Times New Roman" w:cs="Times New Roman"/>
-          <w:b/>
-          <w:bCs/>
+        <w:t>Список</w:t>
+      </w:r>
+      <w:r>
+        <w:rPr>
+          <w:rFonts w:ascii="Times New Roman" w:hAnsi="Times New Roman" w:cs="Times New Roman"/>
           <w:color w:val="000000" w:themeColor="text1"/>
           <w:spacing w:val="-1"/>
           <w:sz w:val="18"/>
           <w:szCs w:val="18"/>
         </w:rPr>
-        <w:t>Список</w:t>
-      </w:r>
-      <w:r>
-        <w:rPr>
-          <w:rFonts w:ascii="Times New Roman" w:hAnsi="Times New Roman" w:cs="Times New Roman"/>
-          <w:color w:val="000000" w:themeColor="text1"/>
-          <w:spacing w:val="-1"/>
-          <w:sz w:val="18"/>
-          <w:szCs w:val="18"/>
-        </w:rPr>
-        <w:t xml:space="preserve"> — это классический пример последовательности</w:t>
-      </w:r>
-      <w:r>
-        <w:rPr>
-          <w:rFonts w:ascii="Times New Roman" w:hAnsi="Times New Roman" w:cs="Times New Roman"/>
-          <w:color w:val="000000" w:themeColor="text1"/>
-          <w:spacing w:val="-1"/>
-          <w:sz w:val="18"/>
-          <w:szCs w:val="18"/>
-        </w:rPr>
-        <w:t>.</w:t>
+        <w:t xml:space="preserve"> — это классический пример последовательности.</w:t>
       </w:r>
     </w:p>
     <w:p>
@@ -29523,7 +29538,25 @@
           <w:sz w:val="18"/>
           <w:szCs w:val="18"/>
         </w:rPr>
-        <w:t>Проводя параллель, можно сказать, что в Python словарь также является объектом, индексируемым ключами (словами), которые имеют связанные с ними значения (смыслы).</w:t>
+        <w:t>Словарь — это структура </w:t>
+      </w:r>
+      <w:r>
+        <w:rPr>
+          <w:rFonts w:ascii="Times New Roman" w:hAnsi="Times New Roman" w:cs="Times New Roman"/>
+          <w:b/>
+          <w:bCs/>
+          <w:sz w:val="18"/>
+          <w:szCs w:val="18"/>
+        </w:rPr>
+        <w:t>ключ → значение</w:t>
+      </w:r>
+      <w:r>
+        <w:rPr>
+          <w:rFonts w:ascii="Times New Roman" w:hAnsi="Times New Roman" w:cs="Times New Roman"/>
+          <w:sz w:val="18"/>
+          <w:szCs w:val="18"/>
+        </w:rPr>
+        <w:t>.</w:t>
       </w:r>
     </w:p>
     <w:p>
@@ -29533,6 +29566,7 @@
           <w:rFonts w:ascii="Times New Roman" w:hAnsi="Times New Roman" w:cs="Times New Roman"/>
           <w:sz w:val="18"/>
           <w:szCs w:val="18"/>
+          <w:lang w:val="en-US"/>
         </w:rPr>
       </w:pPr>
     </w:p>
@@ -29829,42 +29863,6 @@
           <w:szCs w:val="18"/>
         </w:rPr>
         <w:t>Как работать со словарём в Python</w:t>
-      </w:r>
-    </w:p>
-    <w:p>
-      <w:pPr>
-        <w:spacing w:after="0"/>
-        <w:rPr>
-          <w:rFonts w:ascii="Times New Roman" w:hAnsi="Times New Roman" w:cs="Times New Roman"/>
-          <w:sz w:val="18"/>
-          <w:szCs w:val="18"/>
-        </w:rPr>
-      </w:pPr>
-      <w:r>
-        <w:rPr>
-          <w:rFonts w:ascii="Times New Roman" w:hAnsi="Times New Roman" w:cs="Times New Roman"/>
-          <w:sz w:val="18"/>
-          <w:szCs w:val="18"/>
-        </w:rPr>
-        <w:t>Словарь — это структура </w:t>
-      </w:r>
-      <w:r>
-        <w:rPr>
-          <w:rFonts w:ascii="Times New Roman" w:hAnsi="Times New Roman" w:cs="Times New Roman"/>
-          <w:b/>
-          <w:bCs/>
-          <w:sz w:val="18"/>
-          <w:szCs w:val="18"/>
-        </w:rPr>
-        <w:t>ключ → значение</w:t>
-      </w:r>
-      <w:r>
-        <w:rPr>
-          <w:rFonts w:ascii="Times New Roman" w:hAnsi="Times New Roman" w:cs="Times New Roman"/>
-          <w:sz w:val="18"/>
-          <w:szCs w:val="18"/>
-        </w:rPr>
-        <w:t>.</w:t>
       </w:r>
     </w:p>
     <w:p>
@@ -30291,6 +30289,29 @@
           </wp:inline>
         </w:drawing>
       </w:r>
+    </w:p>
+    <w:p>
+      <w:pPr>
+        <w:spacing w:after="0"/>
+        <w:rPr>
+          <w:rFonts w:ascii="Times New Roman" w:hAnsi="Times New Roman" w:cs="Times New Roman"/>
+          <w:b/>
+          <w:bCs/>
+          <w:lang w:val="en-US"/>
+        </w:rPr>
+      </w:pPr>
+    </w:p>
+    <w:p>
+      <w:pPr>
+        <w:spacing w:after="0"/>
+        <w:jc w:val="center"/>
+        <w:rPr>
+          <w:rFonts w:ascii="Times New Roman" w:hAnsi="Times New Roman" w:cs="Times New Roman"/>
+          <w:b/>
+          <w:bCs/>
+          <w:lang w:val="en-US"/>
+        </w:rPr>
+      </w:pPr>
     </w:p>
     <w:p>
       <w:pPr>
@@ -30652,14 +30673,25 @@
         </w:rPr>
         <w:t>Операции</w:t>
       </w:r>
-      <w:r>
-        <w:rPr>
-          <w:rFonts w:ascii="Times New Roman" w:hAnsi="Times New Roman" w:cs="Times New Roman"/>
-          <w:color w:val="595959" w:themeColor="text1" w:themeTint="A6"/>
-          <w:sz w:val="18"/>
-          <w:szCs w:val="18"/>
-        </w:rPr>
-        <w:t>: Попросите пользователя ввести два числа и выведите их сумму, разность, произведение, частное, результат целочисленного деления и остаток от деления.</w:t>
+      <w:proofErr w:type="gramStart"/>
+      <w:r>
+        <w:rPr>
+          <w:rFonts w:ascii="Times New Roman" w:hAnsi="Times New Roman" w:cs="Times New Roman"/>
+          <w:color w:val="595959" w:themeColor="text1" w:themeTint="A6"/>
+          <w:sz w:val="18"/>
+          <w:szCs w:val="18"/>
+        </w:rPr>
+        <w:t>: Попросите</w:t>
+      </w:r>
+      <w:proofErr w:type="gramEnd"/>
+      <w:r>
+        <w:rPr>
+          <w:rFonts w:ascii="Times New Roman" w:hAnsi="Times New Roman" w:cs="Times New Roman"/>
+          <w:color w:val="595959" w:themeColor="text1" w:themeTint="A6"/>
+          <w:sz w:val="18"/>
+          <w:szCs w:val="18"/>
+        </w:rPr>
+        <w:t xml:space="preserve"> пользователя ввести два числа и выведите их сумму, разность, произведение, частное, результат целочисленного деления и остаток от деления.</w:t>
       </w:r>
     </w:p>
     <w:p>
@@ -31506,7 +31538,27 @@
           <w:sz w:val="18"/>
           <w:szCs w:val="18"/>
         </w:rPr>
-        <w:t xml:space="preserve"> Дан список с дубликатами: [1, 2, 2, 3, 4, 4, 4, 5]. Создайте новый список без дубликатов. Объедините списки чтобы получилось 2 списка, первый без дубликатов, второй содержащий только дубликаты.</w:t>
+        <w:t xml:space="preserve"> Дан список с дубликатами: [1, 2, 2, 3, 4, 4, 4, 5]. Создайте новый список без дубликатов. Объедините списки чтобы получилось 2 списка, первый без дубликатов, </w:t>
+      </w:r>
+      <w:proofErr w:type="gramStart"/>
+      <w:r>
+        <w:rPr>
+          <w:rFonts w:ascii="Times New Roman" w:hAnsi="Times New Roman" w:cs="Times New Roman"/>
+          <w:color w:val="595959" w:themeColor="text1" w:themeTint="A6"/>
+          <w:sz w:val="18"/>
+          <w:szCs w:val="18"/>
+        </w:rPr>
+        <w:t>второй</w:t>
+      </w:r>
+      <w:proofErr w:type="gramEnd"/>
+      <w:r>
+        <w:rPr>
+          <w:rFonts w:ascii="Times New Roman" w:hAnsi="Times New Roman" w:cs="Times New Roman"/>
+          <w:color w:val="595959" w:themeColor="text1" w:themeTint="A6"/>
+          <w:sz w:val="18"/>
+          <w:szCs w:val="18"/>
+        </w:rPr>
+        <w:t xml:space="preserve"> содержащий только дубликаты.</w:t>
       </w:r>
     </w:p>
     <w:p>
@@ -31645,6 +31697,7 @@
           <w:color w:val="595959" w:themeColor="text1" w:themeTint="A6"/>
           <w:sz w:val="18"/>
           <w:szCs w:val="18"/>
+          <w:lang w:val="en-US"/>
         </w:rPr>
       </w:pPr>
       <w:r>
@@ -31670,6 +31723,68 @@
     </w:p>
     <w:p>
       <w:pPr>
+        <w:spacing w:after="0"/>
+        <w:rPr>
+          <w:rFonts w:ascii="Times New Roman" w:hAnsi="Times New Roman" w:cs="Times New Roman"/>
+          <w:color w:val="595959" w:themeColor="text1" w:themeTint="A6"/>
+          <w:sz w:val="18"/>
+          <w:szCs w:val="18"/>
+        </w:rPr>
+      </w:pPr>
+      <w:r>
+        <w:rPr>
+          <w:rFonts w:ascii="Times New Roman" w:hAnsi="Times New Roman" w:cs="Times New Roman"/>
+          <w:b/>
+          <w:bCs/>
+          <w:i/>
+          <w:iCs/>
+          <w:color w:val="70AD47" w:themeColor="accent6"/>
+          <w:sz w:val="18"/>
+          <w:szCs w:val="18"/>
+        </w:rPr>
+        <w:t>Решение</w:t>
+      </w:r>
+      <w:r>
+        <w:rPr>
+          <w:rFonts w:ascii="Times New Roman" w:hAnsi="Times New Roman" w:cs="Times New Roman"/>
+          <w:color w:val="595959" w:themeColor="text1" w:themeTint="A6"/>
+          <w:sz w:val="18"/>
+          <w:szCs w:val="18"/>
+        </w:rPr>
+        <w:t xml:space="preserve">: </w:t>
+      </w:r>
+      <w:hyperlink r:id="rId74" w:history="1">
+        <w:r>
+          <w:rPr>
+            <w:rStyle w:val="a3"/>
+            <w:rFonts w:ascii="Times New Roman" w:hAnsi="Times New Roman" w:cs="Times New Roman"/>
+            <w:sz w:val="18"/>
+            <w:szCs w:val="18"/>
+          </w:rPr>
+          <w:t>сс</w:t>
+        </w:r>
+        <w:r>
+          <w:rPr>
+            <w:rStyle w:val="a3"/>
+            <w:rFonts w:ascii="Times New Roman" w:hAnsi="Times New Roman" w:cs="Times New Roman"/>
+            <w:sz w:val="18"/>
+            <w:szCs w:val="18"/>
+          </w:rPr>
+          <w:t>ы</w:t>
+        </w:r>
+        <w:r>
+          <w:rPr>
+            <w:rStyle w:val="a3"/>
+            <w:rFonts w:ascii="Times New Roman" w:hAnsi="Times New Roman" w:cs="Times New Roman"/>
+            <w:sz w:val="18"/>
+            <w:szCs w:val="18"/>
+          </w:rPr>
+          <w:t>лка</w:t>
+        </w:r>
+      </w:hyperlink>
+    </w:p>
+    <w:p>
+      <w:pPr>
         <w:rPr>
           <w:rFonts w:ascii="Times New Roman" w:hAnsi="Times New Roman" w:cs="Times New Roman"/>
           <w:color w:val="595959" w:themeColor="text1" w:themeTint="A6"/>
@@ -31716,6 +31831,116 @@
           <w:szCs w:val="18"/>
         </w:rPr>
       </w:pPr>
+      <w:r>
+        <w:rPr>
+          <w:noProof/>
+        </w:rPr>
+        <w:lastRenderedPageBreak/>
+        <w:drawing>
+          <wp:inline distT="0" distB="0" distL="0" distR="0" wp14:anchorId="35BFA6DB" wp14:editId="77393030">
+            <wp:extent cx="6152515" cy="2261870"/>
+            <wp:effectExtent l="95250" t="114300" r="95885" b="119380"/>
+            <wp:docPr id="8898357" name="Рисунок 1"/>
+            <wp:cNvGraphicFramePr>
+              <a:graphicFrameLocks xmlns:a="http://schemas.openxmlformats.org/drawingml/2006/main" noChangeAspect="1"/>
+            </wp:cNvGraphicFramePr>
+            <a:graphic xmlns:a="http://schemas.openxmlformats.org/drawingml/2006/main">
+              <a:graphicData uri="http://schemas.openxmlformats.org/drawingml/2006/picture">
+                <pic:pic xmlns:pic="http://schemas.openxmlformats.org/drawingml/2006/picture">
+                  <pic:nvPicPr>
+                    <pic:cNvPr id="8898357" name=""/>
+                    <pic:cNvPicPr/>
+                  </pic:nvPicPr>
+                  <pic:blipFill>
+                    <a:blip r:embed="rId75"/>
+                    <a:stretch>
+                      <a:fillRect/>
+                    </a:stretch>
+                  </pic:blipFill>
+                  <pic:spPr>
+                    <a:xfrm>
+                      <a:off x="0" y="0"/>
+                      <a:ext cx="6152515" cy="2261870"/>
+                    </a:xfrm>
+                    <a:prstGeom prst="rect">
+                      <a:avLst/>
+                    </a:prstGeom>
+                    <a:effectLst>
+                      <a:glow rad="101600">
+                        <a:schemeClr val="bg1">
+                          <a:lumMod val="50000"/>
+                          <a:alpha val="60000"/>
+                        </a:schemeClr>
+                      </a:glow>
+                    </a:effectLst>
+                  </pic:spPr>
+                </pic:pic>
+              </a:graphicData>
+            </a:graphic>
+          </wp:inline>
+        </w:drawing>
+      </w:r>
+    </w:p>
+    <w:p>
+      <w:pPr>
+        <w:rPr>
+          <w:rFonts w:ascii="Times New Roman" w:hAnsi="Times New Roman" w:cs="Times New Roman"/>
+          <w:color w:val="595959" w:themeColor="text1" w:themeTint="A6"/>
+          <w:sz w:val="18"/>
+          <w:szCs w:val="18"/>
+          <w:lang w:val="en-US"/>
+        </w:rPr>
+      </w:pPr>
+      <w:r>
+        <w:rPr>
+          <w:noProof/>
+        </w:rPr>
+        <w:drawing>
+          <wp:inline distT="0" distB="0" distL="0" distR="0" wp14:anchorId="3F9CE306" wp14:editId="3CD00780">
+            <wp:extent cx="6152515" cy="3209290"/>
+            <wp:effectExtent l="247650" t="247650" r="248285" b="238760"/>
+            <wp:docPr id="708730205" name="Рисунок 1"/>
+            <wp:cNvGraphicFramePr>
+              <a:graphicFrameLocks xmlns:a="http://schemas.openxmlformats.org/drawingml/2006/main" noChangeAspect="1"/>
+            </wp:cNvGraphicFramePr>
+            <a:graphic xmlns:a="http://schemas.openxmlformats.org/drawingml/2006/main">
+              <a:graphicData uri="http://schemas.openxmlformats.org/drawingml/2006/picture">
+                <pic:pic xmlns:pic="http://schemas.openxmlformats.org/drawingml/2006/picture">
+                  <pic:nvPicPr>
+                    <pic:cNvPr id="708730205" name=""/>
+                    <pic:cNvPicPr/>
+                  </pic:nvPicPr>
+                  <pic:blipFill>
+                    <a:blip r:embed="rId76">
+                      <a:alphaModFix/>
+                    </a:blip>
+                    <a:stretch>
+                      <a:fillRect/>
+                    </a:stretch>
+                  </pic:blipFill>
+                  <pic:spPr>
+                    <a:xfrm>
+                      <a:off x="0" y="0"/>
+                      <a:ext cx="6152515" cy="3209290"/>
+                    </a:xfrm>
+                    <a:prstGeom prst="rect">
+                      <a:avLst/>
+                    </a:prstGeom>
+                    <a:effectLst>
+                      <a:glow rad="241300">
+                        <a:schemeClr val="accent3">
+                          <a:satMod val="175000"/>
+                          <a:alpha val="88000"/>
+                        </a:schemeClr>
+                      </a:glow>
+                    </a:effectLst>
+                  </pic:spPr>
+                </pic:pic>
+              </a:graphicData>
+            </a:graphic>
+          </wp:inline>
+        </w:drawing>
+      </w:r>
     </w:p>
     <w:p>
       <w:pPr>
@@ -31795,7 +32020,6 @@
           <w:sz w:val="18"/>
           <w:szCs w:val="18"/>
         </w:rPr>
-        <w:lastRenderedPageBreak/>
         <w:t>Кортежи</w:t>
       </w:r>
       <w:r>
@@ -32010,8 +32234,8 @@
     </w:p>
     <w:p/>
     <w:sectPr>
-      <w:headerReference w:type="default" r:id="rId74"/>
-      <w:footerReference w:type="default" r:id="rId75"/>
+      <w:headerReference w:type="default" r:id="rId77"/>
+      <w:footerReference w:type="default" r:id="rId78"/>
       <w:pgSz w:w="12240" w:h="20160" w:code="5"/>
       <w:pgMar w:top="1134" w:right="850" w:bottom="1134" w:left="1701" w:header="283" w:footer="397" w:gutter="0"/>
       <w:pgNumType w:start="1"/>
@@ -42920,6 +43144,7 @@
   <w:style w:type="character" w:default="1" w:styleId="a0">
     <w:name w:val="Default Paragraph Font"/>
     <w:uiPriority w:val="1"/>
+    <w:semiHidden/>
     <w:unhideWhenUsed/>
   </w:style>
   <w:style w:type="table" w:default="1" w:styleId="a1">

</xml_diff>